<commit_message>
docs: corregir features del modelo y metricas en documento de entrega
</commit_message>
<xml_diff>
--- a/F1_Proyecto_Final_Noero.docx
+++ b/F1_Proyecto_Final_Noero.docx
@@ -5445,7 +5445,7 @@
           <w:sz w:val="22"/>
           <w:szCs w:val="22"/>
         </w:rPr>
-        <w:t xml:space="preserve">Las siguientes 7 features fueron seleccionadas tras el EDA de la Semana 4, balanceando poder predictivo, disponibilidad de datos y interpretabilidad:</w:t>
+        <w:t xml:space="preserve">Las siguientes 5 features fueron seleccionadas tras el EDA de la Semana 4, balanceando poder predictivo, disponibilidad de datos y interpretabilidad:</w:t>
       </w:r>
     </w:p>
     <w:p>
@@ -6100,214 +6100,6 @@
           </w:p>
         </w:tc>
       </w:tr>
-      <w:tr>
-        <w:tc>
-          <w:tcPr>
-            <w:tcW w:type="dxa" w:w="2000"/>
-            <w:tcBorders>
-              <w:top w:val="single" w:color="CCCCCC" w:sz="1"/>
-              <w:left w:val="single" w:color="CCCCCC" w:sz="1"/>
-              <w:bottom w:val="single" w:color="CCCCCC" w:sz="1"/>
-              <w:right w:val="single" w:color="CCCCCC" w:sz="1"/>
-            </w:tcBorders>
-            <w:shd w:fill="FFFFFF" w:val="clear"/>
-            <w:tcMar>
-              <w:top w:type="dxa" w:w="80"/>
-              <w:left w:type="dxa" w:w="120"/>
-              <w:bottom w:type="dxa" w:w="80"/>
-              <w:right w:type="dxa" w:w="120"/>
-            </w:tcMar>
-            <w:vAlign w:val="center"/>
-          </w:tcPr>
-          <w:p>
-            <w:pPr>
-              <w:jc w:val="left"/>
-            </w:pPr>
-            <w:r>
-              <w:rPr>
-                <w:rFonts w:ascii="Arial" w:cs="Arial" w:eastAsia="Arial" w:hAnsi="Arial"/>
-                <w:b w:val="false"/>
-                <w:bCs w:val="false"/>
-                <w:sz w:val="20"/>
-                <w:szCs w:val="20"/>
-              </w:rPr>
-              <w:t xml:space="preserve">laps</w:t>
-            </w:r>
-          </w:p>
-        </w:tc>
-        <w:tc>
-          <w:tcPr>
-            <w:tcW w:type="dxa" w:w="1600"/>
-            <w:tcBorders>
-              <w:top w:val="single" w:color="CCCCCC" w:sz="1"/>
-              <w:left w:val="single" w:color="CCCCCC" w:sz="1"/>
-              <w:bottom w:val="single" w:color="CCCCCC" w:sz="1"/>
-              <w:right w:val="single" w:color="CCCCCC" w:sz="1"/>
-            </w:tcBorders>
-            <w:shd w:fill="FFFFFF" w:val="clear"/>
-            <w:tcMar>
-              <w:top w:type="dxa" w:w="80"/>
-              <w:left w:type="dxa" w:w="120"/>
-              <w:bottom w:type="dxa" w:w="80"/>
-              <w:right w:type="dxa" w:w="120"/>
-            </w:tcMar>
-            <w:vAlign w:val="center"/>
-          </w:tcPr>
-          <w:p>
-            <w:pPr>
-              <w:jc w:val="left"/>
-            </w:pPr>
-            <w:r>
-              <w:rPr>
-                <w:rFonts w:ascii="Arial" w:cs="Arial" w:eastAsia="Arial" w:hAnsi="Arial"/>
-                <w:b w:val="false"/>
-                <w:bCs w:val="false"/>
-                <w:sz w:val="20"/>
-                <w:szCs w:val="20"/>
-              </w:rPr>
-              <w:t xml:space="preserve">Numérica</w:t>
-            </w:r>
-          </w:p>
-        </w:tc>
-        <w:tc>
-          <w:tcPr>
-            <w:tcW w:type="dxa" w:w="4960"/>
-            <w:tcBorders>
-              <w:top w:val="single" w:color="CCCCCC" w:sz="1"/>
-              <w:left w:val="single" w:color="CCCCCC" w:sz="1"/>
-              <w:bottom w:val="single" w:color="CCCCCC" w:sz="1"/>
-              <w:right w:val="single" w:color="CCCCCC" w:sz="1"/>
-            </w:tcBorders>
-            <w:shd w:fill="FFFFFF" w:val="clear"/>
-            <w:tcMar>
-              <w:top w:type="dxa" w:w="80"/>
-              <w:left w:type="dxa" w:w="120"/>
-              <w:bottom w:type="dxa" w:w="80"/>
-              <w:right w:type="dxa" w:w="120"/>
-            </w:tcMar>
-            <w:vAlign w:val="center"/>
-          </w:tcPr>
-          <w:p>
-            <w:pPr>
-              <w:jc w:val="left"/>
-            </w:pPr>
-            <w:r>
-              <w:rPr>
-                <w:rFonts w:ascii="Arial" w:cs="Arial" w:eastAsia="Arial" w:hAnsi="Arial"/>
-                <w:b w:val="false"/>
-                <w:bCs w:val="false"/>
-                <w:sz w:val="20"/>
-                <w:szCs w:val="20"/>
-              </w:rPr>
-              <w:t xml:space="preserve">Vueltas completadas. Correlaciona fuertemente con los abandonos (proxy de DNF).</w:t>
-            </w:r>
-          </w:p>
-        </w:tc>
-      </w:tr>
-      <w:tr>
-        <w:tc>
-          <w:tcPr>
-            <w:tcW w:type="dxa" w:w="2000"/>
-            <w:tcBorders>
-              <w:top w:val="single" w:color="CCCCCC" w:sz="1"/>
-              <w:left w:val="single" w:color="CCCCCC" w:sz="1"/>
-              <w:bottom w:val="single" w:color="CCCCCC" w:sz="1"/>
-              <w:right w:val="single" w:color="CCCCCC" w:sz="1"/>
-            </w:tcBorders>
-            <w:shd w:fill="FEF9F9" w:val="clear"/>
-            <w:tcMar>
-              <w:top w:type="dxa" w:w="80"/>
-              <w:left w:type="dxa" w:w="120"/>
-              <w:bottom w:type="dxa" w:w="80"/>
-              <w:right w:type="dxa" w:w="120"/>
-            </w:tcMar>
-            <w:vAlign w:val="center"/>
-          </w:tcPr>
-          <w:p>
-            <w:pPr>
-              <w:jc w:val="left"/>
-            </w:pPr>
-            <w:r>
-              <w:rPr>
-                <w:rFonts w:ascii="Arial" w:cs="Arial" w:eastAsia="Arial" w:hAnsi="Arial"/>
-                <w:b w:val="false"/>
-                <w:bCs w:val="false"/>
-                <w:sz w:val="20"/>
-                <w:szCs w:val="20"/>
-              </w:rPr>
-              <w:t xml:space="preserve">finished</w:t>
-            </w:r>
-          </w:p>
-        </w:tc>
-        <w:tc>
-          <w:tcPr>
-            <w:tcW w:type="dxa" w:w="1600"/>
-            <w:tcBorders>
-              <w:top w:val="single" w:color="CCCCCC" w:sz="1"/>
-              <w:left w:val="single" w:color="CCCCCC" w:sz="1"/>
-              <w:bottom w:val="single" w:color="CCCCCC" w:sz="1"/>
-              <w:right w:val="single" w:color="CCCCCC" w:sz="1"/>
-            </w:tcBorders>
-            <w:shd w:fill="FEF9F9" w:val="clear"/>
-            <w:tcMar>
-              <w:top w:type="dxa" w:w="80"/>
-              <w:left w:type="dxa" w:w="120"/>
-              <w:bottom w:type="dxa" w:w="80"/>
-              <w:right w:type="dxa" w:w="120"/>
-            </w:tcMar>
-            <w:vAlign w:val="center"/>
-          </w:tcPr>
-          <w:p>
-            <w:pPr>
-              <w:jc w:val="left"/>
-            </w:pPr>
-            <w:r>
-              <w:rPr>
-                <w:rFonts w:ascii="Arial" w:cs="Arial" w:eastAsia="Arial" w:hAnsi="Arial"/>
-                <w:b w:val="false"/>
-                <w:bCs w:val="false"/>
-                <w:sz w:val="20"/>
-                <w:szCs w:val="20"/>
-              </w:rPr>
-              <w:t xml:space="preserve">Binaria</w:t>
-            </w:r>
-          </w:p>
-        </w:tc>
-        <w:tc>
-          <w:tcPr>
-            <w:tcW w:type="dxa" w:w="4960"/>
-            <w:tcBorders>
-              <w:top w:val="single" w:color="CCCCCC" w:sz="1"/>
-              <w:left w:val="single" w:color="CCCCCC" w:sz="1"/>
-              <w:bottom w:val="single" w:color="CCCCCC" w:sz="1"/>
-              <w:right w:val="single" w:color="CCCCCC" w:sz="1"/>
-            </w:tcBorders>
-            <w:shd w:fill="FEF9F9" w:val="clear"/>
-            <w:tcMar>
-              <w:top w:type="dxa" w:w="80"/>
-              <w:left w:type="dxa" w:w="120"/>
-              <w:bottom w:type="dxa" w:w="80"/>
-              <w:right w:type="dxa" w:w="120"/>
-            </w:tcMar>
-            <w:vAlign w:val="center"/>
-          </w:tcPr>
-          <w:p>
-            <w:pPr>
-              <w:jc w:val="left"/>
-            </w:pPr>
-            <w:r>
-              <w:rPr>
-                <w:rFonts w:ascii="Arial" w:cs="Arial" w:eastAsia="Arial" w:hAnsi="Arial"/>
-                <w:b w:val="false"/>
-                <w:bCs w:val="false"/>
-                <w:sz w:val="20"/>
-                <w:szCs w:val="20"/>
-              </w:rPr>
-              <w:t xml:space="preserve">Indica si el piloto completó la carrera. Variable binaria de alto impacto no lineal.</w:t>
-            </w:r>
-          </w:p>
-        </w:tc>
-      </w:tr>
     </w:tbl>
     <w:p>
       <w:pPr>
@@ -6315,6 +6107,81 @@
       </w:pPr>
       <w:r>
         <w:t xml:space="preserve"/>
+      </w:r>
+    </w:p>
+    <w:p>
+      <w:pPr>
+        <w:spacing w:after="120" w:before="120"/>
+      </w:pPr>
+      <w:r>
+        <w:rPr>
+          <w:rFonts w:ascii="Arial" w:cs="Arial" w:eastAsia="Arial" w:hAnsi="Arial"/>
+          <w:i w:val="true"/>
+          <w:iCs w:val="true"/>
+          <w:sz w:val="20"/>
+          <w:szCs w:val="20"/>
+        </w:rPr>
+        <w:t xml:space="preserve">Nota: las features </w:t>
+      </w:r>
+      <w:r>
+        <w:rPr>
+          <w:rFonts w:ascii="Courier New" w:cs="Courier New" w:eastAsia="Courier New" w:hAnsi="Courier New"/>
+          <w:i w:val="true"/>
+          <w:iCs w:val="true"/>
+          <w:sz w:val="20"/>
+          <w:szCs w:val="20"/>
+        </w:rPr>
+        <w:t xml:space="preserve">laps</w:t>
+      </w:r>
+      <w:r>
+        <w:rPr>
+          <w:rFonts w:ascii="Arial" w:cs="Arial" w:eastAsia="Arial" w:hAnsi="Arial"/>
+          <w:i w:val="true"/>
+          <w:iCs w:val="true"/>
+          <w:sz w:val="20"/>
+          <w:szCs w:val="20"/>
+        </w:rPr>
+        <w:t xml:space="preserve"> y </w:t>
+      </w:r>
+      <w:r>
+        <w:rPr>
+          <w:rFonts w:ascii="Courier New" w:cs="Courier New" w:eastAsia="Courier New" w:hAnsi="Courier New"/>
+          <w:i w:val="true"/>
+          <w:iCs w:val="true"/>
+          <w:sz w:val="20"/>
+          <w:szCs w:val="20"/>
+        </w:rPr>
+        <w:t xml:space="preserve">finished</w:t>
+      </w:r>
+      <w:r>
+        <w:rPr>
+          <w:rFonts w:ascii="Arial" w:cs="Arial" w:eastAsia="Arial" w:hAnsi="Arial"/>
+          <w:i w:val="true"/>
+          <w:iCs w:val="true"/>
+          <w:sz w:val="20"/>
+          <w:szCs w:val="20"/>
+        </w:rPr>
+        <w:t xml:space="preserve">, consideradas en una iteración temprana del análisis, fueron descartadas tras detectarse que constituyen data leakage: ambas contienen información disponible solo después de finalizada la carrera. Su inclusión generaba métricas artificialmente perfectas (R² ≈ 1.0). La lista final de 5 features fue validada en el notebook </w:t>
+      </w:r>
+      <w:r>
+        <w:rPr>
+          <w:rFonts w:ascii="Courier New" w:cs="Courier New" w:eastAsia="Courier New" w:hAnsi="Courier New"/>
+          <w:i w:val="true"/>
+          <w:iCs w:val="true"/>
+          <w:sz w:val="20"/>
+          <w:szCs w:val="20"/>
+        </w:rPr>
+        <w:t xml:space="preserve">06_modelos_avanzados.ipynb</w:t>
+      </w:r>
+      <w:r>
+        <w:rPr>
+          <w:rFonts w:ascii="Arial" w:cs="Arial" w:eastAsia="Arial" w:hAnsi="Arial"/>
+          <w:i w:val="true"/>
+          <w:iCs w:val="true"/>
+          <w:sz w:val="20"/>
+          <w:szCs w:val="20"/>
+        </w:rPr>
+        <w:t xml:space="preserve">.</w:t>
       </w:r>
     </w:p>
     <w:p>
@@ -6973,7 +6840,7 @@
           <w:sz w:val="22"/>
           <w:szCs w:val="22"/>
         </w:rPr>
-        <w:t xml:space="preserve">Se entrenaron y evaluaron cuatro modelos. Los valores de la tabla son aproximados (los exactos dependen de la ejecución del notebook 06); el ranking relativo es consistente entre corridas.</w:t>
+        <w:t xml:space="preserve">Se entrenaron y evaluaron cuatro modelos. Los valores de Random Forest y XGBoost son los obtenidos en la ejecución final del notebook 06 (07_interpretabilidad_conclusiones.ipynb confirma estos mismos valores). Los valores de los modelos baseline (Dummy y Regresión Lineal/Logística) son aproximados de una corrida de referencia, ya que no afectan la elección del modelo final.</w:t>
       </w:r>
     </w:p>
     <w:p>
@@ -7441,7 +7308,7 @@
                 <w:sz w:val="20"/>
                 <w:szCs w:val="20"/>
               </w:rPr>
-              <w:t xml:space="preserve">~3.8</w:t>
+              <w:t xml:space="preserve">2.541</w:t>
             </w:r>
           </w:p>
         </w:tc>
@@ -7942,7 +7809,7 @@
                 <w:sz w:val="20"/>
                 <w:szCs w:val="20"/>
               </w:rPr>
-              <w:t xml:space="preserve">~2.9</w:t>
+              <w:t xml:space="preserve">2.275</w:t>
             </w:r>
           </w:p>
         </w:tc>
@@ -7975,7 +7842,7 @@
                 <w:sz w:val="20"/>
                 <w:szCs w:val="20"/>
               </w:rPr>
-              <w:t xml:space="preserve">~0.65</w:t>
+              <w:t xml:space="preserve">0.620</w:t>
             </w:r>
           </w:p>
         </w:tc>
@@ -8008,7 +7875,7 @@
                 <w:sz w:val="20"/>
                 <w:szCs w:val="20"/>
               </w:rPr>
-              <w:t xml:space="preserve">~0.88</w:t>
+              <w:t xml:space="preserve">0.903</w:t>
             </w:r>
           </w:p>
         </w:tc>
@@ -8109,7 +7976,7 @@
                 <w:sz w:val="20"/>
                 <w:szCs w:val="20"/>
               </w:rPr>
-              <w:t xml:space="preserve">~2.6</w:t>
+              <w:t xml:space="preserve">2.238</w:t>
             </w:r>
           </w:p>
         </w:tc>
@@ -8142,7 +8009,7 @@
                 <w:sz w:val="20"/>
                 <w:szCs w:val="20"/>
               </w:rPr>
-              <w:t xml:space="preserve">~0.70</w:t>
+              <w:t xml:space="preserve">0.626</w:t>
             </w:r>
           </w:p>
         </w:tc>
@@ -8175,7 +8042,7 @@
                 <w:sz w:val="20"/>
                 <w:szCs w:val="20"/>
               </w:rPr>
-              <w:t xml:space="preserve">~0.91</w:t>
+              <w:t xml:space="preserve">0.905</w:t>
             </w:r>
           </w:p>
         </w:tc>
@@ -8350,7 +8217,7 @@
           <w:sz w:val="22"/>
           <w:szCs w:val="22"/>
         </w:rPr>
-        <w:t xml:space="preserve">La posición de grilla es el predictor dominante, seguida del poder del constructor. Los pit stops tienen efecto real pero secundario. Terminar la carrera es un factor binario de alto impacto no lineal, capturado de forma efectiva por los modelos de árbol.</w:t>
+        <w:t xml:space="preserve">La posición de grilla es el predictor dominante, seguida del poder del constructor. Los pit stops tienen efecto real pero secundario, con relaciones no lineales según el número de paradas. La edad del piloto aporta una señal adicional menor, capturada de forma efectiva por los modelos de árbol.</w:t>
       </w:r>
     </w:p>
     <w:p>
@@ -8429,7 +8296,7 @@
           <w:sz w:val="22"/>
           <w:szCs w:val="22"/>
         </w:rPr>
-        <w:t xml:space="preserve">La variable laps actúa como proxy de abandono, no como feature independiente real.</w:t>
+        <w:t xml:space="preserve">No se incorporan variables de telemetría (velocidades, fuerzas G) ni datos de incidentes de carrera (choques, banderas), que podrían explicar parte de la varianza no capturada por el modelo.</w:t>
       </w:r>
     </w:p>
     <w:p>

</xml_diff>